<commit_message>
Sugere orçamento de R$1.500 para Meta Ads e ajusta mensagem ao Giuliano
Une os dois links de tráfego pago em um só item na mensagem (mesma
pasta já enviada), e ajusta a pergunta de orçamento para refletir
que já existe um valor sugerido (R$1.500, igual ao Google) no
documento de estratégia, cabendo ao Giuliano confirmar ou propor
outro.

Co-Authored-By: Claude Sonnet 5 <noreply@anthropic.com>
Claude-Session: https://claude.ai/code/session_01GQSqEjEuqv44iBdACeUWUZ
</commit_message>
<xml_diff>
--- a/eleva/estrategia-meta-ads-portal-sindico.docx
+++ b/eleva/estrategia-meta-ads-portal-sindico.docx
@@ -290,14 +290,23 @@
           <w:sz w:val="21"/>
           <w:szCs w:val="21"/>
         </w:rPr>
-        <w:t xml:space="preserve">O valor específico da verba de Meta ainda precisa ser definido pelo Giuliano</w:t>
-      </w:r>
-      <w:r>
-        <w:rPr>
-          <w:sz w:val="21"/>
-          <w:szCs w:val="21"/>
-        </w:rPr>
-        <w:t xml:space="preserve"> — diferente do Google, aqui não há um saldo parado para aproveitar, então a verba sai do orçamento geral de mídia paga combinado com ele.</w:t>
+        <w:t xml:space="preserve">Sugestão de orçamento: R$ 1.500,00</w:t>
+      </w:r>
+      <w:r>
+        <w:rPr>
+          <w:sz w:val="21"/>
+          <w:szCs w:val="21"/>
+        </w:rPr>
+        <w:t xml:space="preserve">, o mesmo valor da campanha de Google, mantendo as duas frentes de tráfego pago equilibradas durante o lançamento — cerca de R$ 50/dia pelos 30 dias. Diferente do Google, aqui não há um saldo parado para aproveitar, então esse valor sai do orçamento geral de mídia paga do Giuliano. </w:t>
+      </w:r>
+      <w:r>
+        <w:rPr>
+          <w:b/>
+          <w:bCs/>
+          <w:sz w:val="21"/>
+          <w:szCs w:val="21"/>
+        </w:rPr>
+        <w:t xml:space="preserve">Fica para ele confirmar se usa esse valor ou prefere outro.</w:t>
       </w:r>
     </w:p>
     <w:p>

</xml_diff>